<commit_message>
Refocus portfolio on data analytics and BI
</commit_message>
<xml_diff>
--- a/downloads/Ricardo_Avalos_Data_Analyst_Resume_Updated.docx
+++ b/downloads/Ricardo_Avalos_Data_Analyst_Resume_Updated.docx
@@ -4,341 +4,901 @@
   <w:body>
     <w:p>
       <w:pPr>
-        <w:pStyle w:val="Title"/>
+        <w:spacing w:after="20"/>
         <w:jc w:val="center"/>
       </w:pPr>
       <w:r>
+        <w:rPr>
+          <w:rFonts w:ascii="Aptos" w:hAnsi="Aptos"/>
+          <w:b/>
+          <w:color w:val="1F374E"/>
+          <w:sz w:val="33"/>
+        </w:rPr>
         <w:t>RICARDO SERAFIN AVALOS</w:t>
       </w:r>
     </w:p>
     <w:p>
       <w:pPr>
+        <w:spacing w:after="20"/>
         <w:jc w:val="center"/>
       </w:pPr>
       <w:r>
-        <w:t>Toledo, IA | (309) 716-0588 | Ricardoavalos14@icloud.com</w:t>
-        <w:br/>
-        <w:t>Portfolio: https://serafin209.github.io/ricardoavalos.github.io/</w:t>
+        <w:rPr>
+          <w:rFonts w:ascii="Aptos" w:hAnsi="Aptos"/>
+          <w:b/>
+          <w:sz w:val="19"/>
+        </w:rPr>
+        <w:t>Data Analyst | Business Intelligence | Operations Analytics</w:t>
       </w:r>
     </w:p>
     <w:p>
       <w:pPr>
-        <w:pStyle w:val="Heading2"/>
+        <w:spacing w:after="60"/>
+        <w:jc w:val="center"/>
       </w:pPr>
       <w:r>
+        <w:rPr>
+          <w:rFonts w:ascii="Aptos" w:hAnsi="Aptos"/>
+          <w:sz w:val="17"/>
+        </w:rPr>
+        <w:t>Toledo, IA  |  (309) 716-0588  |  Ricardoavalos14@icloud.com</w:t>
+      </w:r>
+      <w:r>
+        <w:br/>
+      </w:r>
+      <w:r>
+        <w:rPr>
+          <w:rFonts w:ascii="Aptos" w:hAnsi="Aptos"/>
+          <w:sz w:val="17"/>
+        </w:rPr>
+        <w:t>linkedin.com/in/ricardo-avalos-6baa04236  |  serafin209.github.io/ricardoavalos.github.io/</w:t>
+      </w:r>
+    </w:p>
+    <w:p>
+      <w:pPr>
+        <w:keepNext/>
+        <w:spacing w:before="80" w:after="40"/>
+        <w:pBdr>
+          <w:bottom w:val="single" w:sz="5" w:space="2" w:color="A6B7C8"/>
+        </w:pBdr>
+      </w:pPr>
+      <w:r>
+        <w:rPr>
+          <w:rFonts w:ascii="Aptos" w:hAnsi="Aptos"/>
+          <w:b/>
+          <w:color w:val="1F374E"/>
+          <w:sz w:val="19"/>
+        </w:rPr>
         <w:t>PROFESSIONAL SUMMARY</w:t>
       </w:r>
     </w:p>
     <w:p>
+      <w:pPr>
+        <w:spacing w:after="40" w:line="245" w:lineRule="auto"/>
+      </w:pPr>
       <w:r>
-        <w:t>Analytical and results-driven operations professional with 5+ years of leadership experience at Amazon leveraging data to improve operational performance, reduce defects, and optimize business processes. Experienced collaborating with Software Development Engineers (SDEs) and cross-functional teams to solve complex operational challenges using data-driven decision making. Skilled in Excel, SQL, Python, KPI reporting, root cause analysis, and process improvement, with additional training in front-end development and cybersecurity. Seeking a Data Analyst, Business Analyst, or Supply Chain Analyst position where analytical and technical skills can drive measurable business outcomes.</w:t>
+        <w:rPr>
+          <w:rFonts w:ascii="Aptos" w:hAnsi="Aptos"/>
+          <w:sz w:val="17"/>
+        </w:rPr>
+        <w:t>Data analyst and operations leader with more than five years of Amazon experience using KPIs, root-cause analysis, and process data to improve productivity, quality, and workflow performance. Recently completed the TripleTen Data Analytics certificate with hands-on projects in SQL, Python, Power BI, Tableau, forecasting, cohort analysis, and machine learning. Skilled at translating complex data into clear dashboards and actionable business recommendations.</w:t>
       </w:r>
     </w:p>
     <w:p>
       <w:pPr>
-        <w:pStyle w:val="Heading2"/>
+        <w:keepNext/>
+        <w:spacing w:before="80" w:after="40"/>
+        <w:pBdr>
+          <w:bottom w:val="single" w:sz="5" w:space="2" w:color="A6B7C8"/>
+        </w:pBdr>
       </w:pPr>
       <w:r>
-        <w:t>CORE TECHNICAL SKILLS</w:t>
+        <w:rPr>
+          <w:rFonts w:ascii="Aptos" w:hAnsi="Aptos"/>
+          <w:b/>
+          <w:color w:val="1F374E"/>
+          <w:sz w:val="19"/>
+        </w:rPr>
+        <w:t>TECHNICAL SKILLS</w:t>
+      </w:r>
+    </w:p>
+    <w:p>
+      <w:pPr>
+        <w:spacing w:after="40" w:line="252" w:lineRule="auto"/>
+      </w:pPr>
+      <w:r>
+        <w:rPr>
+          <w:rFonts w:ascii="Aptos" w:hAnsi="Aptos"/>
+          <w:b/>
+          <w:sz w:val="17"/>
+        </w:rPr>
+        <w:t xml:space="preserve">Analytics: </w:t>
+      </w:r>
+      <w:r>
+        <w:rPr>
+          <w:rFonts w:ascii="Aptos" w:hAnsi="Aptos"/>
+          <w:sz w:val="17"/>
+        </w:rPr>
+        <w:t>SQL, Python, pandas, Excel, Pivot Tables, VLOOKUP/XLOOKUP, data cleaning, exploratory data analysis</w:t>
+        <w:br/>
+      </w:r>
+      <w:r>
+        <w:rPr>
+          <w:rFonts w:ascii="Aptos" w:hAnsi="Aptos"/>
+          <w:b/>
+          <w:sz w:val="17"/>
+        </w:rPr>
+        <w:t xml:space="preserve">Business Intelligence: </w:t>
+      </w:r>
+      <w:r>
+        <w:rPr>
+          <w:rFonts w:ascii="Aptos" w:hAnsi="Aptos"/>
+          <w:sz w:val="17"/>
+        </w:rPr>
+        <w:t>Power BI, Tableau, DAX, Power Query, KPI dashboards, data visualization, forecasting, cohort analysis</w:t>
+        <w:br/>
+      </w:r>
+      <w:r>
+        <w:rPr>
+          <w:rFonts w:ascii="Aptos" w:hAnsi="Aptos"/>
+          <w:b/>
+          <w:sz w:val="17"/>
+        </w:rPr>
+        <w:t xml:space="preserve">Modeling: </w:t>
+      </w:r>
+      <w:r>
+        <w:rPr>
+          <w:rFonts w:ascii="Aptos" w:hAnsi="Aptos"/>
+          <w:sz w:val="17"/>
+        </w:rPr>
+        <w:t>Regression, classification, decision trees, model evaluation, MAE, MSE, accuracy, precision, recall</w:t>
+        <w:br/>
+      </w:r>
+      <w:r>
+        <w:rPr>
+          <w:rFonts w:ascii="Aptos" w:hAnsi="Aptos"/>
+          <w:b/>
+          <w:sz w:val="17"/>
+        </w:rPr>
+        <w:t xml:space="preserve">Additional: </w:t>
+      </w:r>
+      <w:r>
+        <w:rPr>
+          <w:rFonts w:ascii="Aptos" w:hAnsi="Aptos"/>
+          <w:sz w:val="17"/>
+        </w:rPr>
+        <w:t>Git, GitHub, HTML, CSS, JavaScript, cybersecurity fundamentals; bilingual English and Spanish</w:t>
+      </w:r>
+    </w:p>
+    <w:p>
+      <w:pPr>
+        <w:keepNext/>
+        <w:spacing w:before="80" w:after="40"/>
+        <w:pBdr>
+          <w:bottom w:val="single" w:sz="5" w:space="2" w:color="A6B7C8"/>
+        </w:pBdr>
+      </w:pPr>
+      <w:r>
+        <w:rPr>
+          <w:rFonts w:ascii="Aptos" w:hAnsi="Aptos"/>
+          <w:b/>
+          <w:color w:val="1F374E"/>
+          <w:sz w:val="19"/>
+        </w:rPr>
+        <w:t>ANALYTICS PROJECTS</w:t>
+      </w:r>
+    </w:p>
+    <w:p>
+      <w:pPr>
+        <w:keepNext/>
+        <w:spacing w:before="30" w:after="8"/>
+      </w:pPr>
+      <w:r>
+        <w:rPr>
+          <w:rFonts w:ascii="Aptos" w:hAnsi="Aptos"/>
+          <w:b/>
+          <w:sz w:val="18"/>
+        </w:rPr>
+        <w:t>Marketing Performance and Revenue Forecast</w:t>
+      </w:r>
+      <w:r>
+        <w:rPr>
+          <w:rFonts w:ascii="Aptos" w:hAnsi="Aptos"/>
+          <w:b w:val="0"/>
+          <w:color w:val="505050"/>
+          <w:sz w:val="17"/>
+        </w:rPr>
+        <w:t xml:space="preserve"> | PostgreSQL, Python, Power BI</w:t>
       </w:r>
     </w:p>
     <w:p>
       <w:pPr>
         <w:pStyle w:val="ListBullet"/>
+        <w:keepLines/>
+        <w:spacing w:after="8" w:line="240" w:lineRule="auto"/>
+        <w:ind w:left="259" w:hanging="173"/>
       </w:pPr>
       <w:r>
         <w:rPr>
-          <w:b/>
+          <w:rFonts w:ascii="Aptos" w:hAnsi="Aptos"/>
+          <w:sz w:val="16"/>
         </w:rPr>
-        <w:t xml:space="preserve">Data Analytics: </w:t>
-      </w:r>
-      <w:r>
-        <w:t>Microsoft Excel (Pivot Tables, VLOOKUP/XLOOKUP), KPI Reporting, Root Cause Analysis, Dashboard Development, Data Visualization, Process Improvement</w:t>
+        <w:t>Built an end-to-end analysis of approximately 17,000 orders and $6.66M in revenue across 2024–2025, combining sales, customer, and campaign data.</w:t>
       </w:r>
     </w:p>
     <w:p>
       <w:pPr>
         <w:pStyle w:val="ListBullet"/>
+        <w:keepLines/>
+        <w:spacing w:after="8" w:line="240" w:lineRule="auto"/>
+        <w:ind w:left="259" w:hanging="173"/>
       </w:pPr>
       <w:r>
         <w:rPr>
-          <w:b/>
+          <w:rFonts w:ascii="Aptos" w:hAnsi="Aptos"/>
+          <w:sz w:val="16"/>
         </w:rPr>
-        <w:t xml:space="preserve">Programming: </w:t>
-      </w:r>
-      <w:r>
-        <w:t>SQL, Python, Java, HTML5, CSS3, JavaScript</w:t>
+        <w:t>Created KPI dashboards, campaign and channel analysis, customer cohort matrices, and a 12-month revenue forecast of $3.34M with a 95% confidence range of $2.96M–$3.71M.</w:t>
       </w:r>
     </w:p>
     <w:p>
       <w:pPr>
         <w:pStyle w:val="ListBullet"/>
+        <w:keepLines/>
+        <w:spacing w:after="8" w:line="240" w:lineRule="auto"/>
+        <w:ind w:left="259" w:hanging="173"/>
       </w:pPr>
       <w:r>
         <w:rPr>
+          <w:rFonts w:ascii="Aptos" w:hAnsi="Aptos"/>
+          <w:sz w:val="16"/>
+        </w:rPr>
+        <w:t>Cleaned duplicate headers, missing campaign values, and unknown product categories in Power Query; documented exclusions affecting 1,442 no-campaign orders.</w:t>
+      </w:r>
+    </w:p>
+    <w:p>
+      <w:pPr>
+        <w:keepNext/>
+        <w:spacing w:before="30" w:after="8"/>
+      </w:pPr>
+      <w:r>
+        <w:rPr>
+          <w:rFonts w:ascii="Aptos" w:hAnsi="Aptos"/>
           <w:b/>
+          <w:sz w:val="18"/>
         </w:rPr>
-        <w:t xml:space="preserve">Business Analysis: </w:t>
+        <w:t>Shopify App Store Analysis</w:t>
       </w:r>
       <w:r>
-        <w:t>Requirements Analysis, Cross-Functional Collaboration, Operational Analytics, Forecasting, Process Mapping</w:t>
+        <w:rPr>
+          <w:rFonts w:ascii="Aptos" w:hAnsi="Aptos"/>
+          <w:b w:val="0"/>
+          <w:color w:val="505050"/>
+          <w:sz w:val="17"/>
+        </w:rPr>
+        <w:t xml:space="preserve"> | Power BI, DAX, Power Query</w:t>
       </w:r>
     </w:p>
     <w:p>
       <w:pPr>
         <w:pStyle w:val="ListBullet"/>
+        <w:keepLines/>
+        <w:spacing w:after="8" w:line="240" w:lineRule="auto"/>
+        <w:ind w:left="259" w:hanging="173"/>
       </w:pPr>
       <w:r>
         <w:rPr>
-          <w:b/>
+          <w:rFonts w:ascii="Aptos" w:hAnsi="Aptos"/>
+          <w:sz w:val="16"/>
         </w:rPr>
-        <w:t xml:space="preserve">Tools: </w:t>
-      </w:r>
-      <w:r>
-        <w:t>Git, GitHub, VS Code, Microsoft Office</w:t>
-      </w:r>
-    </w:p>
-    <w:p>
-      <w:pPr>
-        <w:pStyle w:val="Heading2"/>
-      </w:pPr>
-      <w:r>
-        <w:t>PROFESSIONAL EXPERIENCE</w:t>
-      </w:r>
-    </w:p>
-    <w:p>
-      <w:pPr>
-        <w:pStyle w:val="Heading3"/>
-      </w:pPr>
-      <w:r>
-        <w:t>Amazon.com | Area Manager I</w:t>
-      </w:r>
-    </w:p>
-    <w:p>
-      <w:r>
-        <w:t>August 2025 – Present</w:t>
+        <w:t>Designed a star schema connecting apps, reviews, and a date dimension; created measures for total reviews, ratings, developer reply rate, and period-over-period trends.</w:t>
       </w:r>
     </w:p>
     <w:p>
       <w:pPr>
         <w:pStyle w:val="ListBullet"/>
+        <w:keepLines/>
+        <w:spacing w:after="8" w:line="240" w:lineRule="auto"/>
+        <w:ind w:left="259" w:hanging="173"/>
       </w:pPr>
       <w:r>
-        <w:t>Lead inbound operations processing 15,000–30,000 units per shift while consistently achieving operational performance targets.</w:t>
+        <w:rPr>
+          <w:rFonts w:ascii="Aptos" w:hAnsi="Aptos"/>
+          <w:sz w:val="16"/>
+        </w:rPr>
+        <w:t>Built Overview and Time Intelligence pages with category breakdowns, continuous monthly trends, YTD/MTD analysis, slicers, annotations, and page navigation.</w:t>
+      </w:r>
+    </w:p>
+    <w:p>
+      <w:pPr>
+        <w:keepNext/>
+        <w:spacing w:before="30" w:after="8"/>
+      </w:pPr>
+      <w:r>
+        <w:rPr>
+          <w:rFonts w:ascii="Aptos" w:hAnsi="Aptos"/>
+          <w:b/>
+          <w:sz w:val="18"/>
+        </w:rPr>
+        <w:t>Retail Customer Shopping Behavior Analysis</w:t>
+      </w:r>
+      <w:r>
+        <w:rPr>
+          <w:rFonts w:ascii="Aptos" w:hAnsi="Aptos"/>
+          <w:b w:val="0"/>
+          <w:color w:val="505050"/>
+          <w:sz w:val="17"/>
+        </w:rPr>
+        <w:t xml:space="preserve"> | Python, PostgreSQL, Power BI</w:t>
       </w:r>
     </w:p>
     <w:p>
       <w:pPr>
         <w:pStyle w:val="ListBullet"/>
+        <w:keepLines/>
+        <w:spacing w:after="8" w:line="240" w:lineRule="auto"/>
+        <w:ind w:left="259" w:hanging="173"/>
       </w:pPr>
       <w:r>
-        <w:t>Analyze operational KPIs to identify trends and optimize labor allocation, increasing stow productivity by 16%.</w:t>
+        <w:rPr>
+          <w:rFonts w:ascii="Aptos" w:hAnsi="Aptos"/>
+          <w:sz w:val="16"/>
+        </w:rPr>
+        <w:t>Cleaned and transformed nearly 3,900 customer purchase records with pandas, including category-based median imputation, standardized fields, age segmentation, and purchase-frequency mapping.</w:t>
       </w:r>
     </w:p>
     <w:p>
       <w:pPr>
         <w:pStyle w:val="ListBullet"/>
+        <w:keepLines/>
+        <w:spacing w:after="8" w:line="240" w:lineRule="auto"/>
+        <w:ind w:left="259" w:hanging="173"/>
       </w:pPr>
       <w:r>
-        <w:t>Reduced dock-to-stock cycle time by 20% through workflow optimization and standardized operational procedures.</w:t>
+        <w:rPr>
+          <w:rFonts w:ascii="Aptos" w:hAnsi="Aptos"/>
+          <w:sz w:val="16"/>
+        </w:rPr>
+        <w:t>Wrote SQL analyses for revenue by demographic group, subscription and discount behavior, repeat buyers, product rankings, shipping patterns, and customer segments; presented findings in an interactive Power BI dashboard.</w:t>
+      </w:r>
+    </w:p>
+    <w:p>
+      <w:pPr>
+        <w:keepNext/>
+        <w:spacing w:before="80" w:after="40"/>
+        <w:pBdr>
+          <w:bottom w:val="single" w:sz="5" w:space="2" w:color="A6B7C8"/>
+        </w:pBdr>
+      </w:pPr>
+      <w:r>
+        <w:rPr>
+          <w:rFonts w:ascii="Aptos" w:hAnsi="Aptos"/>
+          <w:b/>
+          <w:color w:val="1F374E"/>
+          <w:sz w:val="19"/>
+        </w:rPr>
+        <w:t>PROFESSIONAL EXPERIENCE</w:t>
+      </w:r>
+    </w:p>
+    <w:tbl>
+      <w:tblPr>
+        <w:tblW w:type="auto" w:w="0"/>
+        <w:tblLayout w:type="fixed"/>
+        <w:tblLook w:firstColumn="1" w:firstRow="1" w:lastColumn="0" w:lastRow="0" w:noHBand="0" w:noVBand="1" w:val="04A0"/>
+      </w:tblPr>
+      <w:tblGrid>
+        <w:gridCol w:w="7488"/>
+        <w:gridCol w:w="2448"/>
+      </w:tblGrid>
+      <w:tr>
+        <w:tc>
+          <w:tcPr>
+            <w:tcW w:type="dxa" w:w="5285"/>
+            <w:tcMar>
+              <w:top w:w="0" w:type="dxa"/>
+              <w:start w:w="0" w:type="dxa"/>
+              <w:bottom w:w="0" w:type="dxa"/>
+              <w:end w:w="0" w:type="dxa"/>
+            </w:tcMar>
+          </w:tcPr>
+          <w:p>
+            <w:pPr>
+              <w:spacing w:after="0"/>
+            </w:pPr>
+            <w:r>
+              <w:rPr>
+                <w:rFonts w:ascii="Aptos" w:hAnsi="Aptos"/>
+                <w:b/>
+                <w:sz w:val="20"/>
+              </w:rPr>
+              <w:t>Amazon.com | Area Manager I</w:t>
+            </w:r>
+          </w:p>
+        </w:tc>
+        <w:tc>
+          <w:tcPr>
+            <w:tcW w:type="dxa" w:w="5285"/>
+            <w:tcMar>
+              <w:top w:w="0" w:type="dxa"/>
+              <w:start w:w="0" w:type="dxa"/>
+              <w:bottom w:w="0" w:type="dxa"/>
+              <w:end w:w="0" w:type="dxa"/>
+            </w:tcMar>
+          </w:tcPr>
+          <w:p>
+            <w:pPr>
+              <w:spacing w:after="0"/>
+              <w:jc w:val="right"/>
+            </w:pPr>
+            <w:r>
+              <w:rPr>
+                <w:rFonts w:ascii="Aptos" w:hAnsi="Aptos"/>
+                <w:b/>
+                <w:sz w:val="19"/>
+              </w:rPr>
+              <w:t>Aug 2025–Jul 2026</w:t>
+            </w:r>
+          </w:p>
+        </w:tc>
+      </w:tr>
+    </w:tbl>
+    <w:p>
+      <w:pPr>
+        <w:pStyle w:val="ListBullet"/>
+        <w:keepLines/>
+        <w:spacing w:after="8" w:line="240" w:lineRule="auto"/>
+        <w:ind w:left="259" w:hanging="173"/>
+      </w:pPr>
+      <w:r>
+        <w:rPr>
+          <w:rFonts w:ascii="Aptos" w:hAnsi="Aptos"/>
+          <w:sz w:val="17"/>
+        </w:rPr>
+        <w:t>Lead high-volume inbound operations processing 15,000–30,000 units per shift while managing safety, quality, productivity, and customer-service goals.</w:t>
       </w:r>
     </w:p>
     <w:p>
       <w:pPr>
         <w:pStyle w:val="ListBullet"/>
+        <w:keepLines/>
+        <w:spacing w:after="8" w:line="240" w:lineRule="auto"/>
+        <w:ind w:left="259" w:hanging="173"/>
       </w:pPr>
       <w:r>
-        <w:t>Partner with Software Development Engineers (SDEs), IT, RME, and Central Flow to resolve system issues and improve operational efficiency.</w:t>
+        <w:rPr>
+          <w:rFonts w:ascii="Aptos" w:hAnsi="Aptos"/>
+          <w:sz w:val="17"/>
+        </w:rPr>
+        <w:t>Analyze operational KPIs and capacity data to optimize labor allocation, contributing to a 16% increase in stow productivity.</w:t>
       </w:r>
     </w:p>
     <w:p>
       <w:pPr>
         <w:pStyle w:val="ListBullet"/>
+        <w:keepLines/>
+        <w:spacing w:after="8" w:line="240" w:lineRule="auto"/>
+        <w:ind w:left="259" w:hanging="173"/>
       </w:pPr>
       <w:r>
-        <w:t>Develop data-driven staffing and workflow plans while training 50+ associates on updated processes.</w:t>
-      </w:r>
-    </w:p>
-    <w:p>
-      <w:pPr>
-        <w:pStyle w:val="Heading3"/>
-      </w:pPr>
-      <w:r>
-        <w:t>Amazon.com | Process Assistant</w:t>
-      </w:r>
-    </w:p>
-    <w:p>
-      <w:r>
-        <w:t>November 2020 – August 2025</w:t>
+        <w:rPr>
+          <w:rFonts w:ascii="Aptos" w:hAnsi="Aptos"/>
+          <w:sz w:val="17"/>
+        </w:rPr>
+        <w:t>Reduced dock-to-stock cycle time by 20% through workflow analysis, standardized procedures, and cross-functional problem solving.</w:t>
       </w:r>
     </w:p>
     <w:p>
       <w:pPr>
         <w:pStyle w:val="ListBullet"/>
+        <w:keepLines/>
+        <w:spacing w:after="8" w:line="240" w:lineRule="auto"/>
+        <w:ind w:left="259" w:hanging="173"/>
       </w:pPr>
       <w:r>
-        <w:t>Collaborated with Software Development Engineers to troubleshoot operational tools, reducing drive dwell time by 22%.</w:t>
+        <w:rPr>
+          <w:rFonts w:ascii="Aptos" w:hAnsi="Aptos"/>
+          <w:sz w:val="17"/>
+        </w:rPr>
+        <w:t>Partner with Software Development Engineers, IT, RME, and Central Flow to diagnose issues; coach and develop 50+ associates.</w:t>
+      </w:r>
+    </w:p>
+    <w:tbl>
+      <w:tblPr>
+        <w:tblW w:type="auto" w:w="0"/>
+        <w:tblLayout w:type="fixed"/>
+        <w:tblLook w:firstColumn="1" w:firstRow="1" w:lastColumn="0" w:lastRow="0" w:noHBand="0" w:noVBand="1" w:val="04A0"/>
+      </w:tblPr>
+      <w:tblGrid>
+        <w:gridCol w:w="7488"/>
+        <w:gridCol w:w="2448"/>
+      </w:tblGrid>
+      <w:tr>
+        <w:tc>
+          <w:tcPr>
+            <w:tcW w:type="dxa" w:w="5285"/>
+            <w:tcMar>
+              <w:top w:w="0" w:type="dxa"/>
+              <w:start w:w="0" w:type="dxa"/>
+              <w:bottom w:w="0" w:type="dxa"/>
+              <w:end w:w="0" w:type="dxa"/>
+            </w:tcMar>
+          </w:tcPr>
+          <w:p>
+            <w:pPr>
+              <w:spacing w:after="0"/>
+            </w:pPr>
+            <w:r>
+              <w:rPr>
+                <w:rFonts w:ascii="Aptos" w:hAnsi="Aptos"/>
+                <w:b/>
+                <w:sz w:val="20"/>
+              </w:rPr>
+              <w:t>Amazon.com | Process Assistant</w:t>
+            </w:r>
+          </w:p>
+        </w:tc>
+        <w:tc>
+          <w:tcPr>
+            <w:tcW w:type="dxa" w:w="5285"/>
+            <w:tcMar>
+              <w:top w:w="0" w:type="dxa"/>
+              <w:start w:w="0" w:type="dxa"/>
+              <w:bottom w:w="0" w:type="dxa"/>
+              <w:end w:w="0" w:type="dxa"/>
+            </w:tcMar>
+          </w:tcPr>
+          <w:p>
+            <w:pPr>
+              <w:spacing w:after="0"/>
+              <w:jc w:val="right"/>
+            </w:pPr>
+            <w:r>
+              <w:rPr>
+                <w:rFonts w:ascii="Aptos" w:hAnsi="Aptos"/>
+                <w:b/>
+                <w:sz w:val="19"/>
+              </w:rPr>
+              <w:t>Nov 2020–Aug 2025</w:t>
+            </w:r>
+          </w:p>
+        </w:tc>
+      </w:tr>
+    </w:tbl>
+    <w:p>
+      <w:pPr>
+        <w:pStyle w:val="ListBullet"/>
+        <w:keepLines/>
+        <w:spacing w:after="8" w:line="240" w:lineRule="auto"/>
+        <w:ind w:left="259" w:hanging="173"/>
+      </w:pPr>
+      <w:r>
+        <w:rPr>
+          <w:rFonts w:ascii="Aptos" w:hAnsi="Aptos"/>
+          <w:sz w:val="17"/>
+        </w:rPr>
+        <w:t>Led shift execution and root-cause analyses; created standardized inbound templates that increased unload productivity by 57 units per hour.</w:t>
       </w:r>
     </w:p>
     <w:p>
       <w:pPr>
         <w:pStyle w:val="ListBullet"/>
+        <w:keepLines/>
+        <w:spacing w:after="8" w:line="240" w:lineRule="auto"/>
+        <w:ind w:left="259" w:hanging="173"/>
       </w:pPr>
       <w:r>
-        <w:t>Performed deep-dive analysis to improve package routing accuracy and reduce operational defects.</w:t>
+        <w:rPr>
+          <w:rFonts w:ascii="Aptos" w:hAnsi="Aptos"/>
+          <w:sz w:val="17"/>
+        </w:rPr>
+        <w:t>Reduced operational defects from 8% to 3% and Problem Solve backlog from 12% to 2–3%; trained Process Assistants and Shift Coordinators.</w:t>
+      </w:r>
+    </w:p>
+    <w:tbl>
+      <w:tblPr>
+        <w:tblW w:type="auto" w:w="0"/>
+        <w:tblLayout w:type="fixed"/>
+        <w:tblLook w:firstColumn="1" w:firstRow="1" w:lastColumn="0" w:lastRow="0" w:noHBand="0" w:noVBand="1" w:val="04A0"/>
+      </w:tblPr>
+      <w:tblGrid>
+        <w:gridCol w:w="7488"/>
+        <w:gridCol w:w="2448"/>
+      </w:tblGrid>
+      <w:tr>
+        <w:tc>
+          <w:tcPr>
+            <w:tcW w:type="dxa" w:w="5285"/>
+            <w:tcMar>
+              <w:top w:w="0" w:type="dxa"/>
+              <w:start w:w="0" w:type="dxa"/>
+              <w:bottom w:w="0" w:type="dxa"/>
+              <w:end w:w="0" w:type="dxa"/>
+            </w:tcMar>
+          </w:tcPr>
+          <w:p>
+            <w:pPr>
+              <w:spacing w:after="0"/>
+            </w:pPr>
+            <w:r>
+              <w:rPr>
+                <w:rFonts w:ascii="Aptos" w:hAnsi="Aptos"/>
+                <w:b/>
+                <w:sz w:val="20"/>
+              </w:rPr>
+              <w:t>Boot Barn | Sales Associate</w:t>
+            </w:r>
+          </w:p>
+        </w:tc>
+        <w:tc>
+          <w:tcPr>
+            <w:tcW w:type="dxa" w:w="5285"/>
+            <w:tcMar>
+              <w:top w:w="0" w:type="dxa"/>
+              <w:start w:w="0" w:type="dxa"/>
+              <w:bottom w:w="0" w:type="dxa"/>
+              <w:end w:w="0" w:type="dxa"/>
+            </w:tcMar>
+          </w:tcPr>
+          <w:p>
+            <w:pPr>
+              <w:spacing w:after="0"/>
+              <w:jc w:val="right"/>
+            </w:pPr>
+            <w:r>
+              <w:rPr>
+                <w:rFonts w:ascii="Aptos" w:hAnsi="Aptos"/>
+                <w:b/>
+                <w:sz w:val="19"/>
+              </w:rPr>
+              <w:t>May 2019–Apr 2020</w:t>
+            </w:r>
+          </w:p>
+        </w:tc>
+      </w:tr>
+    </w:tbl>
+    <w:p>
+      <w:pPr>
+        <w:pStyle w:val="ListBullet"/>
+        <w:keepLines/>
+        <w:spacing w:after="8" w:line="240" w:lineRule="auto"/>
+        <w:ind w:left="259" w:hanging="173"/>
+      </w:pPr>
+      <w:r>
+        <w:rPr>
+          <w:rFonts w:ascii="Aptos" w:hAnsi="Aptos"/>
+          <w:sz w:val="17"/>
+        </w:rPr>
+        <w:t>Supported customer service, inventory control, merchandising, and daily store operations.</w:t>
       </w:r>
     </w:p>
     <w:p>
       <w:pPr>
-        <w:pStyle w:val="ListBullet"/>
+        <w:keepNext/>
+        <w:spacing w:before="80" w:after="40"/>
+        <w:pBdr>
+          <w:bottom w:val="single" w:sz="5" w:space="2" w:color="A6B7C8"/>
+        </w:pBdr>
       </w:pPr>
       <w:r>
-        <w:t>Created standardized inbound templates that increased unload productivity by 57 units per hour.</w:t>
+        <w:rPr>
+          <w:rFonts w:ascii="Aptos" w:hAnsi="Aptos"/>
+          <w:b/>
+          <w:color w:val="1F374E"/>
+          <w:sz w:val="19"/>
+        </w:rPr>
+        <w:t>EDUCATION AND CERTIFICATES</w:t>
       </w:r>
     </w:p>
-    <w:p>
-      <w:pPr>
-        <w:pStyle w:val="ListBullet"/>
-      </w:pPr>
-      <w:r>
-        <w:t>Improved One Flow scanning processes, reducing operational defects from 8% to 3%.</w:t>
-      </w:r>
-    </w:p>
-    <w:p>
-      <w:pPr>
-        <w:pStyle w:val="ListBullet"/>
-      </w:pPr>
-      <w:r>
-        <w:t>Redesigned Problem Solve workflows, reducing backlog from 12% to 2–3% through root cause analysis.</w:t>
-      </w:r>
-    </w:p>
-    <w:p>
-      <w:pPr>
-        <w:pStyle w:val="Heading3"/>
-      </w:pPr>
-      <w:r>
-        <w:t>Boot Barn | Sales Associate</w:t>
-      </w:r>
-    </w:p>
-    <w:p>
-      <w:r>
-        <w:t>May 2019 – April 2020</w:t>
-      </w:r>
-    </w:p>
-    <w:p>
-      <w:pPr>
-        <w:pStyle w:val="ListBullet"/>
-      </w:pPr>
-      <w:r>
-        <w:t>Analyzed sales trends and customer demand to improve merchandising decisions and inventory organization.</w:t>
-      </w:r>
-    </w:p>
-    <w:p>
-      <w:pPr>
-        <w:pStyle w:val="Heading2"/>
-      </w:pPr>
-      <w:r>
-        <w:t>TECHNICAL PROJECTS</w:t>
-      </w:r>
-    </w:p>
-    <w:p>
-      <w:r>
-        <w:rPr>
-          <w:b/>
-        </w:rPr>
-        <w:t>Amazon Operations Analytics</w:t>
-      </w:r>
-      <w:r>
-        <w:br/>
-        <w:t>Used Excel Pivot Tables to analyze quality defects, robotics lane utilization, and operational KPIs to support workflow improvements.</w:t>
-      </w:r>
-    </w:p>
-    <w:p>
-      <w:r>
-        <w:rPr>
-          <w:b/>
-        </w:rPr>
-        <w:t>Excel KPI Dashboard</w:t>
-      </w:r>
-      <w:r>
-        <w:br/>
-        <w:t>Created executive-style KPI reports using Pivot Tables and performance metrics for operational decision making.</w:t>
-      </w:r>
-    </w:p>
-    <w:p>
-      <w:r>
-        <w:rPr>
-          <w:b/>
-        </w:rPr>
-        <w:t>SQL Analytics Portfolio</w:t>
-      </w:r>
-      <w:r>
-        <w:br/>
-        <w:t>Developed SQL queries using JOINs, aggregations, filtering, and reporting techniques to analyze business datasets.</w:t>
-      </w:r>
-    </w:p>
-    <w:p>
-      <w:r>
-        <w:rPr>
-          <w:b/>
-        </w:rPr>
-        <w:t>Python Data Analysis</w:t>
-      </w:r>
-      <w:r>
-        <w:br/>
-        <w:t>Applied Python to automate data processing and solve analytical problems while strengthening programming skills.</w:t>
-      </w:r>
-    </w:p>
-    <w:p>
-      <w:r>
-        <w:rPr>
-          <w:b/>
-        </w:rPr>
-        <w:t>Enterprise Risk Analytics</w:t>
-      </w:r>
-      <w:r>
-        <w:br/>
-        <w:t>Performed analytical assessments of operational and security risks, documenting recommendations and mitigation strategies.</w:t>
-      </w:r>
-    </w:p>
-    <w:p>
-      <w:pPr>
-        <w:pStyle w:val="Heading2"/>
-      </w:pPr>
-      <w:r>
-        <w:t>EDUCATION &amp; CERTIFICATIONS</w:t>
-      </w:r>
-    </w:p>
-    <w:p>
-      <w:r>
-        <w:t>Southern New Hampshire University</w:t>
-        <w:br/>
-        <w:t>Certificate – Cybersecurity</w:t>
-      </w:r>
-    </w:p>
-    <w:p>
-      <w:r>
-        <w:t>Kenzie Academy</w:t>
-        <w:br/>
-        <w:t>Certificate – Front-End Web Development</w:t>
-      </w:r>
-    </w:p>
-    <w:p>
-      <w:pPr>
-        <w:pStyle w:val="Heading2"/>
-      </w:pPr>
-      <w:r>
-        <w:t>LANGUAGES</w:t>
-      </w:r>
-    </w:p>
-    <w:p>
-      <w:r>
-        <w:t>English | Spanish</w:t>
-      </w:r>
-    </w:p>
+    <w:tbl>
+      <w:tblPr>
+        <w:tblW w:type="auto" w:w="0"/>
+        <w:tblLayout w:type="fixed"/>
+        <w:tblLook w:firstColumn="1" w:firstRow="1" w:lastColumn="0" w:lastRow="0" w:noHBand="0" w:noVBand="1" w:val="04A0"/>
+      </w:tblPr>
+      <w:tblGrid>
+        <w:gridCol w:w="8208"/>
+        <w:gridCol w:w="1728"/>
+      </w:tblGrid>
+      <w:tr>
+        <w:tc>
+          <w:tcPr>
+            <w:tcW w:type="dxa" w:w="5285"/>
+            <w:tcMar>
+              <w:top w:w="0" w:type="dxa"/>
+              <w:start w:w="0" w:type="dxa"/>
+              <w:bottom w:w="0" w:type="dxa"/>
+              <w:end w:w="0" w:type="dxa"/>
+            </w:tcMar>
+          </w:tcPr>
+          <w:p>
+            <w:pPr>
+              <w:spacing w:after="0"/>
+            </w:pPr>
+            <w:r>
+              <w:rPr>
+                <w:rFonts w:ascii="Aptos" w:hAnsi="Aptos"/>
+                <w:b/>
+                <w:sz w:val="19"/>
+              </w:rPr>
+              <w:t>TripleTen</w:t>
+            </w:r>
+            <w:r>
+              <w:rPr>
+                <w:rFonts w:ascii="Aptos" w:hAnsi="Aptos"/>
+                <w:sz w:val="18"/>
+              </w:rPr>
+              <w:t xml:space="preserve"> — Data Analytics Certificate</w:t>
+            </w:r>
+          </w:p>
+        </w:tc>
+        <w:tc>
+          <w:tcPr>
+            <w:tcW w:type="dxa" w:w="5285"/>
+            <w:tcMar>
+              <w:top w:w="0" w:type="dxa"/>
+              <w:start w:w="0" w:type="dxa"/>
+              <w:bottom w:w="0" w:type="dxa"/>
+              <w:end w:w="0" w:type="dxa"/>
+            </w:tcMar>
+          </w:tcPr>
+          <w:p>
+            <w:pPr>
+              <w:spacing w:after="0"/>
+              <w:jc w:val="right"/>
+            </w:pPr>
+            <w:r>
+              <w:rPr>
+                <w:rFonts w:ascii="Aptos" w:hAnsi="Aptos"/>
+                <w:b/>
+                <w:sz w:val="18"/>
+              </w:rPr>
+              <w:t>Sep 2026</w:t>
+            </w:r>
+          </w:p>
+        </w:tc>
+      </w:tr>
+    </w:tbl>
+    <w:tbl>
+      <w:tblPr>
+        <w:tblW w:type="auto" w:w="0"/>
+        <w:tblLayout w:type="fixed"/>
+        <w:tblLook w:firstColumn="1" w:firstRow="1" w:lastColumn="0" w:lastRow="0" w:noHBand="0" w:noVBand="1" w:val="04A0"/>
+      </w:tblPr>
+      <w:tblGrid>
+        <w:gridCol w:w="8208"/>
+        <w:gridCol w:w="1728"/>
+      </w:tblGrid>
+      <w:tr>
+        <w:tc>
+          <w:tcPr>
+            <w:tcW w:type="dxa" w:w="5285"/>
+            <w:tcMar>
+              <w:top w:w="0" w:type="dxa"/>
+              <w:start w:w="0" w:type="dxa"/>
+              <w:bottom w:w="0" w:type="dxa"/>
+              <w:end w:w="0" w:type="dxa"/>
+            </w:tcMar>
+          </w:tcPr>
+          <w:p>
+            <w:pPr>
+              <w:spacing w:after="0"/>
+            </w:pPr>
+            <w:r>
+              <w:rPr>
+                <w:rFonts w:ascii="Aptos" w:hAnsi="Aptos"/>
+                <w:b/>
+                <w:sz w:val="19"/>
+              </w:rPr>
+              <w:t>Southern New Hampshire University</w:t>
+            </w:r>
+            <w:r>
+              <w:rPr>
+                <w:rFonts w:ascii="Aptos" w:hAnsi="Aptos"/>
+                <w:sz w:val="18"/>
+              </w:rPr>
+              <w:t xml:space="preserve"> — Certificate in Cybersecurity</w:t>
+            </w:r>
+          </w:p>
+        </w:tc>
+        <w:tc>
+          <w:tcPr>
+            <w:tcW w:type="dxa" w:w="5285"/>
+            <w:tcMar>
+              <w:top w:w="0" w:type="dxa"/>
+              <w:start w:w="0" w:type="dxa"/>
+              <w:bottom w:w="0" w:type="dxa"/>
+              <w:end w:w="0" w:type="dxa"/>
+            </w:tcMar>
+          </w:tcPr>
+          <w:p>
+            <w:pPr>
+              <w:spacing w:after="0"/>
+              <w:jc w:val="right"/>
+            </w:pPr>
+            <w:r>
+              <w:rPr>
+                <w:rFonts w:ascii="Aptos" w:hAnsi="Aptos"/>
+                <w:b/>
+                <w:sz w:val="18"/>
+              </w:rPr>
+              <w:t>May 2025</w:t>
+            </w:r>
+          </w:p>
+        </w:tc>
+      </w:tr>
+    </w:tbl>
+    <w:tbl>
+      <w:tblPr>
+        <w:tblW w:type="auto" w:w="0"/>
+        <w:tblLayout w:type="fixed"/>
+        <w:tblLook w:firstColumn="1" w:firstRow="1" w:lastColumn="0" w:lastRow="0" w:noHBand="0" w:noVBand="1" w:val="04A0"/>
+      </w:tblPr>
+      <w:tblGrid>
+        <w:gridCol w:w="8208"/>
+        <w:gridCol w:w="1728"/>
+      </w:tblGrid>
+      <w:tr>
+        <w:tc>
+          <w:tcPr>
+            <w:tcW w:type="dxa" w:w="5285"/>
+            <w:tcMar>
+              <w:top w:w="0" w:type="dxa"/>
+              <w:start w:w="0" w:type="dxa"/>
+              <w:bottom w:w="0" w:type="dxa"/>
+              <w:end w:w="0" w:type="dxa"/>
+            </w:tcMar>
+          </w:tcPr>
+          <w:p>
+            <w:pPr>
+              <w:spacing w:after="0"/>
+            </w:pPr>
+            <w:r>
+              <w:rPr>
+                <w:rFonts w:ascii="Aptos" w:hAnsi="Aptos"/>
+                <w:b/>
+                <w:sz w:val="19"/>
+              </w:rPr>
+              <w:t>Kenzie Academy</w:t>
+            </w:r>
+            <w:r>
+              <w:rPr>
+                <w:rFonts w:ascii="Aptos" w:hAnsi="Aptos"/>
+                <w:sz w:val="18"/>
+              </w:rPr>
+              <w:t xml:space="preserve"> — Front-End Web Development Certificate</w:t>
+            </w:r>
+          </w:p>
+        </w:tc>
+        <w:tc>
+          <w:tcPr>
+            <w:tcW w:type="dxa" w:w="5285"/>
+            <w:tcMar>
+              <w:top w:w="0" w:type="dxa"/>
+              <w:start w:w="0" w:type="dxa"/>
+              <w:bottom w:w="0" w:type="dxa"/>
+              <w:end w:w="0" w:type="dxa"/>
+            </w:tcMar>
+          </w:tcPr>
+          <w:p>
+            <w:pPr>
+              <w:spacing w:after="0"/>
+              <w:jc w:val="right"/>
+            </w:pPr>
+            <w:r>
+              <w:rPr>
+                <w:rFonts w:ascii="Aptos" w:hAnsi="Aptos"/>
+                <w:b/>
+                <w:sz w:val="18"/>
+              </w:rPr>
+              <w:t>2022</w:t>
+            </w:r>
+          </w:p>
+        </w:tc>
+      </w:tr>
+    </w:tbl>
     <w:sectPr>
       <w:pgSz w:w="12240" w:h="15840"/>
-      <w:pgMar w:top="1440" w:right="1800" w:bottom="1440" w:left="1800" w:header="720" w:footer="720" w:gutter="0"/>
+      <w:pgMar w:top="461" w:right="835" w:bottom="461" w:left="835" w:header="720" w:footer="720" w:gutter="0"/>
       <w:cols w:space="720"/>
       <w:docGrid w:linePitch="360"/>
     </w:sectPr>
@@ -710,8 +1270,8 @@
     <w:qFormat/>
     <w:rsid w:val="00FC693F"/>
     <w:rPr>
-      <w:rFonts w:ascii="Calibri" w:hAnsi="Calibri"/>
-      <w:sz w:val="21"/>
+      <w:rFonts w:ascii="Aptos" w:hAnsi="Aptos"/>
+      <w:sz w:val="17"/>
     </w:rPr>
   </w:style>
   <w:style w:type="paragraph" w:styleId="Header">

</xml_diff>